<commit_message>
add bank word file
</commit_message>
<xml_diff>
--- a/Banking_Application_Questions.docx
+++ b/Banking_Application_Questions.docx
@@ -4264,17 +4264,124 @@
     </w:p>
     <w:p>
       <w:r>
-        <w:br/>
+        <w:rPr>
+          <w:noProof/>
+        </w:rPr>
+        <w:drawing>
+          <wp:anchor distT="0" distB="0" distL="114300" distR="114300" simplePos="0" relativeHeight="251726848" behindDoc="0" locked="0" layoutInCell="1" allowOverlap="1" wp14:anchorId="1720E830" wp14:editId="47EECE4B">
+            <wp:simplePos x="0" y="0"/>
+            <wp:positionH relativeFrom="column">
+              <wp:posOffset>38100</wp:posOffset>
+            </wp:positionH>
+            <wp:positionV relativeFrom="paragraph">
+              <wp:posOffset>381000</wp:posOffset>
+            </wp:positionV>
+            <wp:extent cx="3705742" cy="3248478"/>
+            <wp:effectExtent l="0" t="0" r="9525" b="9525"/>
+            <wp:wrapTopAndBottom/>
+            <wp:docPr id="8" name="Picture 8"/>
+            <wp:cNvGraphicFramePr>
+              <a:graphicFrameLocks xmlns:a="http://schemas.openxmlformats.org/drawingml/2006/main" noChangeAspect="1"/>
+            </wp:cNvGraphicFramePr>
+            <a:graphic xmlns:a="http://schemas.openxmlformats.org/drawingml/2006/main">
+              <a:graphicData uri="http://schemas.openxmlformats.org/drawingml/2006/picture">
+                <pic:pic xmlns:pic="http://schemas.openxmlformats.org/drawingml/2006/picture">
+                  <pic:nvPicPr>
+                    <pic:cNvPr id="8" name="Screenshot 2026-05-26 124852.png"/>
+                    <pic:cNvPicPr/>
+                  </pic:nvPicPr>
+                  <pic:blipFill>
+                    <a:blip r:embed="rId69"/>
+                    <a:stretch>
+                      <a:fillRect/>
+                    </a:stretch>
+                  </pic:blipFill>
+                  <pic:spPr>
+                    <a:xfrm>
+                      <a:off x="0" y="0"/>
+                      <a:ext cx="3705742" cy="3248478"/>
+                    </a:xfrm>
+                    <a:prstGeom prst="rect">
+                      <a:avLst/>
+                    </a:prstGeom>
+                  </pic:spPr>
+                </pic:pic>
+              </a:graphicData>
+            </a:graphic>
+          </wp:anchor>
+        </w:drawing>
+      </w:r>
+    </w:p>
+    <w:p/>
+    <w:p>
+      <w:r>
         <w:t>73. Can the user check the balance?</w:t>
       </w:r>
     </w:p>
     <w:p>
       <w:r>
-        <w:t xml:space="preserve">User can chick balance </w:t>
+        <w:t>User can chick balance</w:t>
       </w:r>
     </w:p>
     <w:p>
       <w:r>
+        <w:rPr>
+          <w:noProof/>
+        </w:rPr>
+        <w:drawing>
+          <wp:anchor distT="0" distB="0" distL="114300" distR="114300" simplePos="0" relativeHeight="251727872" behindDoc="0" locked="0" layoutInCell="1" allowOverlap="1" wp14:anchorId="3A5D35BE" wp14:editId="08D0AEFF">
+            <wp:simplePos x="0" y="0"/>
+            <wp:positionH relativeFrom="column">
+              <wp:posOffset>428625</wp:posOffset>
+            </wp:positionH>
+            <wp:positionV relativeFrom="paragraph">
+              <wp:posOffset>377825</wp:posOffset>
+            </wp:positionV>
+            <wp:extent cx="1886213" cy="209579"/>
+            <wp:effectExtent l="0" t="0" r="0" b="0"/>
+            <wp:wrapTopAndBottom/>
+            <wp:docPr id="15" name="Picture 15"/>
+            <wp:cNvGraphicFramePr>
+              <a:graphicFrameLocks xmlns:a="http://schemas.openxmlformats.org/drawingml/2006/main" noChangeAspect="1"/>
+            </wp:cNvGraphicFramePr>
+            <a:graphic xmlns:a="http://schemas.openxmlformats.org/drawingml/2006/main">
+              <a:graphicData uri="http://schemas.openxmlformats.org/drawingml/2006/picture">
+                <pic:pic xmlns:pic="http://schemas.openxmlformats.org/drawingml/2006/picture">
+                  <pic:nvPicPr>
+                    <pic:cNvPr id="15" name="Screenshot 2026-05-26 124938.png"/>
+                    <pic:cNvPicPr/>
+                  </pic:nvPicPr>
+                  <pic:blipFill>
+                    <a:blip r:embed="rId70"/>
+                    <a:stretch>
+                      <a:fillRect/>
+                    </a:stretch>
+                  </pic:blipFill>
+                  <pic:spPr>
+                    <a:xfrm>
+                      <a:off x="0" y="0"/>
+                      <a:ext cx="1886213" cy="209579"/>
+                    </a:xfrm>
+                    <a:prstGeom prst="rect">
+                      <a:avLst/>
+                    </a:prstGeom>
+                  </pic:spPr>
+                </pic:pic>
+              </a:graphicData>
+            </a:graphic>
+          </wp:anchor>
+        </w:drawing>
+      </w:r>
+    </w:p>
+    <w:p/>
+    <w:p/>
+    <w:p>
+      <w:r>
+        <w:t xml:space="preserve"> </w:t>
+      </w:r>
+    </w:p>
+    <w:p>
+      <w:r>
         <w:br/>
         <w:t>74. Can the user deposit money?</w:t>
       </w:r>
@@ -4286,124 +4393,480 @@
     </w:p>
     <w:p>
       <w:r>
+        <w:rPr>
+          <w:noProof/>
+        </w:rPr>
+        <w:drawing>
+          <wp:anchor distT="0" distB="0" distL="114300" distR="114300" simplePos="0" relativeHeight="251728896" behindDoc="0" locked="0" layoutInCell="1" allowOverlap="1" wp14:anchorId="50BA6C2B" wp14:editId="26512BC4">
+            <wp:simplePos x="0" y="0"/>
+            <wp:positionH relativeFrom="column">
+              <wp:posOffset>561975</wp:posOffset>
+            </wp:positionH>
+            <wp:positionV relativeFrom="paragraph">
+              <wp:posOffset>254635</wp:posOffset>
+            </wp:positionV>
+            <wp:extent cx="1867161" cy="209579"/>
+            <wp:effectExtent l="0" t="0" r="0" b="0"/>
+            <wp:wrapTopAndBottom/>
+            <wp:docPr id="16" name="Picture 16"/>
+            <wp:cNvGraphicFramePr>
+              <a:graphicFrameLocks xmlns:a="http://schemas.openxmlformats.org/drawingml/2006/main" noChangeAspect="1"/>
+            </wp:cNvGraphicFramePr>
+            <a:graphic xmlns:a="http://schemas.openxmlformats.org/drawingml/2006/main">
+              <a:graphicData uri="http://schemas.openxmlformats.org/drawingml/2006/picture">
+                <pic:pic xmlns:pic="http://schemas.openxmlformats.org/drawingml/2006/picture">
+                  <pic:nvPicPr>
+                    <pic:cNvPr id="16" name="Screenshot 2026-05-26 125008.png"/>
+                    <pic:cNvPicPr/>
+                  </pic:nvPicPr>
+                  <pic:blipFill>
+                    <a:blip r:embed="rId71"/>
+                    <a:stretch>
+                      <a:fillRect/>
+                    </a:stretch>
+                  </pic:blipFill>
+                  <pic:spPr>
+                    <a:xfrm>
+                      <a:off x="0" y="0"/>
+                      <a:ext cx="1867161" cy="209579"/>
+                    </a:xfrm>
+                    <a:prstGeom prst="rect">
+                      <a:avLst/>
+                    </a:prstGeom>
+                  </pic:spPr>
+                </pic:pic>
+              </a:graphicData>
+            </a:graphic>
+          </wp:anchor>
+        </w:drawing>
+      </w:r>
+    </w:p>
+    <w:p>
+      <w:r>
+        <w:lastRenderedPageBreak/>
         <w:br/>
         <w:t>75. Can the user withdraw money?</w:t>
       </w:r>
     </w:p>
     <w:p>
       <w:r>
+        <w:rPr>
+          <w:noProof/>
+        </w:rPr>
+        <w:drawing>
+          <wp:anchor distT="0" distB="0" distL="114300" distR="114300" simplePos="0" relativeHeight="251729920" behindDoc="0" locked="0" layoutInCell="1" allowOverlap="1" wp14:anchorId="1C5F06AD" wp14:editId="7134F4BD">
+            <wp:simplePos x="0" y="0"/>
+            <wp:positionH relativeFrom="column">
+              <wp:posOffset>561975</wp:posOffset>
+            </wp:positionH>
+            <wp:positionV relativeFrom="paragraph">
+              <wp:posOffset>401320</wp:posOffset>
+            </wp:positionV>
+            <wp:extent cx="1581371" cy="228632"/>
+            <wp:effectExtent l="0" t="0" r="0" b="0"/>
+            <wp:wrapTopAndBottom/>
+            <wp:docPr id="38" name="Picture 38"/>
+            <wp:cNvGraphicFramePr>
+              <a:graphicFrameLocks xmlns:a="http://schemas.openxmlformats.org/drawingml/2006/main" noChangeAspect="1"/>
+            </wp:cNvGraphicFramePr>
+            <a:graphic xmlns:a="http://schemas.openxmlformats.org/drawingml/2006/main">
+              <a:graphicData uri="http://schemas.openxmlformats.org/drawingml/2006/picture">
+                <pic:pic xmlns:pic="http://schemas.openxmlformats.org/drawingml/2006/picture">
+                  <pic:nvPicPr>
+                    <pic:cNvPr id="38" name="Screenshot 2026-05-26 125034.png"/>
+                    <pic:cNvPicPr/>
+                  </pic:nvPicPr>
+                  <pic:blipFill>
+                    <a:blip r:embed="rId72"/>
+                    <a:stretch>
+                      <a:fillRect/>
+                    </a:stretch>
+                  </pic:blipFill>
+                  <pic:spPr>
+                    <a:xfrm>
+                      <a:off x="0" y="0"/>
+                      <a:ext cx="1581371" cy="228632"/>
+                    </a:xfrm>
+                    <a:prstGeom prst="rect">
+                      <a:avLst/>
+                    </a:prstGeom>
+                  </pic:spPr>
+                </pic:pic>
+              </a:graphicData>
+            </a:graphic>
+          </wp:anchor>
+        </w:drawing>
+      </w:r>
+      <w:r>
         <w:t>User can withdraw money</w:t>
+      </w:r>
+    </w:p>
+    <w:p/>
+    <w:p/>
+    <w:p>
+      <w:r>
+        <w:br/>
+        <w:t>76. Can the user view transaction history?</w:t>
       </w:r>
     </w:p>
     <w:p>
       <w:r>
-        <w:br/>
-        <w:t>76. Can the user view transaction history?</w:t>
+        <w:t xml:space="preserve">User can view transaction history </w:t>
       </w:r>
     </w:p>
     <w:p>
       <w:r>
-        <w:t xml:space="preserve">User can view transaction history </w:t>
+        <w:rPr>
+          <w:noProof/>
+        </w:rPr>
+        <w:drawing>
+          <wp:anchor distT="0" distB="0" distL="114300" distR="114300" simplePos="0" relativeHeight="251730944" behindDoc="0" locked="0" layoutInCell="1" allowOverlap="1" wp14:anchorId="1705F931" wp14:editId="316CFEC3">
+            <wp:simplePos x="0" y="0"/>
+            <wp:positionH relativeFrom="column">
+              <wp:posOffset>695325</wp:posOffset>
+            </wp:positionH>
+            <wp:positionV relativeFrom="paragraph">
+              <wp:posOffset>293370</wp:posOffset>
+            </wp:positionV>
+            <wp:extent cx="1762371" cy="219106"/>
+            <wp:effectExtent l="0" t="0" r="0" b="9525"/>
+            <wp:wrapTopAndBottom/>
+            <wp:docPr id="43" name="Picture 43"/>
+            <wp:cNvGraphicFramePr>
+              <a:graphicFrameLocks xmlns:a="http://schemas.openxmlformats.org/drawingml/2006/main" noChangeAspect="1"/>
+            </wp:cNvGraphicFramePr>
+            <a:graphic xmlns:a="http://schemas.openxmlformats.org/drawingml/2006/main">
+              <a:graphicData uri="http://schemas.openxmlformats.org/drawingml/2006/picture">
+                <pic:pic xmlns:pic="http://schemas.openxmlformats.org/drawingml/2006/picture">
+                  <pic:nvPicPr>
+                    <pic:cNvPr id="43" name="Screenshot 2026-05-26 125104.png"/>
+                    <pic:cNvPicPr/>
+                  </pic:nvPicPr>
+                  <pic:blipFill>
+                    <a:blip r:embed="rId73"/>
+                    <a:stretch>
+                      <a:fillRect/>
+                    </a:stretch>
+                  </pic:blipFill>
+                  <pic:spPr>
+                    <a:xfrm>
+                      <a:off x="0" y="0"/>
+                      <a:ext cx="1762371" cy="219106"/>
+                    </a:xfrm>
+                    <a:prstGeom prst="rect">
+                      <a:avLst/>
+                    </a:prstGeom>
+                  </pic:spPr>
+                </pic:pic>
+              </a:graphicData>
+            </a:graphic>
+          </wp:anchor>
+        </w:drawing>
+      </w:r>
+    </w:p>
+    <w:p/>
+    <w:p>
+      <w:r>
+        <w:br/>
+        <w:t>77. Can the user exit the application?</w:t>
       </w:r>
     </w:p>
     <w:p>
       <w:r>
-        <w:br/>
-        <w:t>77. Can the user exit the application?</w:t>
+        <w:rPr>
+          <w:noProof/>
+        </w:rPr>
+        <w:drawing>
+          <wp:anchor distT="0" distB="0" distL="114300" distR="114300" simplePos="0" relativeHeight="251731968" behindDoc="0" locked="0" layoutInCell="1" allowOverlap="1" wp14:anchorId="7DE41284" wp14:editId="34FF73D9">
+            <wp:simplePos x="0" y="0"/>
+            <wp:positionH relativeFrom="column">
+              <wp:posOffset>533400</wp:posOffset>
+            </wp:positionH>
+            <wp:positionV relativeFrom="paragraph">
+              <wp:posOffset>304800</wp:posOffset>
+            </wp:positionV>
+            <wp:extent cx="2972215" cy="476316"/>
+            <wp:effectExtent l="0" t="0" r="0" b="0"/>
+            <wp:wrapTopAndBottom/>
+            <wp:docPr id="46" name="Picture 46"/>
+            <wp:cNvGraphicFramePr>
+              <a:graphicFrameLocks xmlns:a="http://schemas.openxmlformats.org/drawingml/2006/main" noChangeAspect="1"/>
+            </wp:cNvGraphicFramePr>
+            <a:graphic xmlns:a="http://schemas.openxmlformats.org/drawingml/2006/main">
+              <a:graphicData uri="http://schemas.openxmlformats.org/drawingml/2006/picture">
+                <pic:pic xmlns:pic="http://schemas.openxmlformats.org/drawingml/2006/picture">
+                  <pic:nvPicPr>
+                    <pic:cNvPr id="46" name="Screenshot 2026-05-26 125128.png"/>
+                    <pic:cNvPicPr/>
+                  </pic:nvPicPr>
+                  <pic:blipFill>
+                    <a:blip r:embed="rId74"/>
+                    <a:stretch>
+                      <a:fillRect/>
+                    </a:stretch>
+                  </pic:blipFill>
+                  <pic:spPr>
+                    <a:xfrm>
+                      <a:off x="0" y="0"/>
+                      <a:ext cx="2972215" cy="476316"/>
+                    </a:xfrm>
+                    <a:prstGeom prst="rect">
+                      <a:avLst/>
+                    </a:prstGeom>
+                  </pic:spPr>
+                </pic:pic>
+              </a:graphicData>
+            </a:graphic>
+          </wp:anchor>
+        </w:drawing>
+      </w:r>
+      <w:r>
+        <w:t>User can exit application</w:t>
       </w:r>
     </w:p>
     <w:p>
       <w:r>
-        <w:t>User can exit application</w:t>
+        <w:br/>
+        <w:t>78. Does the application handle invalid menu options?</w:t>
       </w:r>
     </w:p>
     <w:p>
       <w:r>
+        <w:rPr>
+          <w:noProof/>
+        </w:rPr>
+        <w:drawing>
+          <wp:anchor distT="0" distB="0" distL="114300" distR="114300" simplePos="0" relativeHeight="251732992" behindDoc="0" locked="0" layoutInCell="1" allowOverlap="1" wp14:anchorId="4488184E" wp14:editId="50B1F3EB">
+            <wp:simplePos x="0" y="0"/>
+            <wp:positionH relativeFrom="column">
+              <wp:posOffset>457200</wp:posOffset>
+            </wp:positionH>
+            <wp:positionV relativeFrom="paragraph">
+              <wp:posOffset>458470</wp:posOffset>
+            </wp:positionV>
+            <wp:extent cx="2734057" cy="1066949"/>
+            <wp:effectExtent l="0" t="0" r="9525" b="0"/>
+            <wp:wrapTopAndBottom/>
+            <wp:docPr id="48" name="Picture 48"/>
+            <wp:cNvGraphicFramePr>
+              <a:graphicFrameLocks xmlns:a="http://schemas.openxmlformats.org/drawingml/2006/main" noChangeAspect="1"/>
+            </wp:cNvGraphicFramePr>
+            <a:graphic xmlns:a="http://schemas.openxmlformats.org/drawingml/2006/main">
+              <a:graphicData uri="http://schemas.openxmlformats.org/drawingml/2006/picture">
+                <pic:pic xmlns:pic="http://schemas.openxmlformats.org/drawingml/2006/picture">
+                  <pic:nvPicPr>
+                    <pic:cNvPr id="48" name="Screenshot 2026-05-26 125642.png"/>
+                    <pic:cNvPicPr/>
+                  </pic:nvPicPr>
+                  <pic:blipFill>
+                    <a:blip r:embed="rId75"/>
+                    <a:stretch>
+                      <a:fillRect/>
+                    </a:stretch>
+                  </pic:blipFill>
+                  <pic:spPr>
+                    <a:xfrm>
+                      <a:off x="0" y="0"/>
+                      <a:ext cx="2734057" cy="1066949"/>
+                    </a:xfrm>
+                    <a:prstGeom prst="rect">
+                      <a:avLst/>
+                    </a:prstGeom>
+                  </pic:spPr>
+                </pic:pic>
+              </a:graphicData>
+            </a:graphic>
+          </wp:anchor>
+        </w:drawing>
+      </w:r>
+      <w:r>
+        <w:t xml:space="preserve">Invalid menu options handled </w:t>
+      </w:r>
+    </w:p>
+    <w:p/>
+    <w:p/>
+    <w:p>
+      <w:r>
         <w:br/>
-        <w:t>78. Does the application handle invalid menu options?</w:t>
+      </w:r>
+    </w:p>
+    <w:p/>
+    <w:p>
+      <w:r>
+        <w:lastRenderedPageBreak/>
+        <w:t>79. Does the application handle invalid money values?</w:t>
       </w:r>
     </w:p>
     <w:p>
       <w:r>
-        <w:t xml:space="preserve">Invalid menu options handled </w:t>
+        <w:t xml:space="preserve">Invalid money values handled </w:t>
       </w:r>
     </w:p>
     <w:p>
       <w:r>
+        <w:rPr>
+          <w:noProof/>
+        </w:rPr>
+        <w:drawing>
+          <wp:anchor distT="0" distB="0" distL="114300" distR="114300" simplePos="0" relativeHeight="251734016" behindDoc="0" locked="0" layoutInCell="1" allowOverlap="1" wp14:anchorId="4736DE58" wp14:editId="27A9239B">
+            <wp:simplePos x="0" y="0"/>
+            <wp:positionH relativeFrom="column">
+              <wp:posOffset>704850</wp:posOffset>
+            </wp:positionH>
+            <wp:positionV relativeFrom="paragraph">
+              <wp:posOffset>179070</wp:posOffset>
+            </wp:positionV>
+            <wp:extent cx="2562583" cy="962159"/>
+            <wp:effectExtent l="0" t="0" r="9525" b="9525"/>
+            <wp:wrapTopAndBottom/>
+            <wp:docPr id="67" name="Picture 67"/>
+            <wp:cNvGraphicFramePr>
+              <a:graphicFrameLocks xmlns:a="http://schemas.openxmlformats.org/drawingml/2006/main" noChangeAspect="1"/>
+            </wp:cNvGraphicFramePr>
+            <a:graphic xmlns:a="http://schemas.openxmlformats.org/drawingml/2006/main">
+              <a:graphicData uri="http://schemas.openxmlformats.org/drawingml/2006/picture">
+                <pic:pic xmlns:pic="http://schemas.openxmlformats.org/drawingml/2006/picture">
+                  <pic:nvPicPr>
+                    <pic:cNvPr id="67" name="Screenshot 2026-05-26 125845.png"/>
+                    <pic:cNvPicPr/>
+                  </pic:nvPicPr>
+                  <pic:blipFill>
+                    <a:blip r:embed="rId76"/>
+                    <a:stretch>
+                      <a:fillRect/>
+                    </a:stretch>
+                  </pic:blipFill>
+                  <pic:spPr>
+                    <a:xfrm>
+                      <a:off x="0" y="0"/>
+                      <a:ext cx="2562583" cy="962159"/>
+                    </a:xfrm>
+                    <a:prstGeom prst="rect">
+                      <a:avLst/>
+                    </a:prstGeom>
+                  </pic:spPr>
+                </pic:pic>
+              </a:graphicData>
+            </a:graphic>
+          </wp:anchor>
+        </w:drawing>
+      </w:r>
+    </w:p>
+    <w:p/>
+    <w:p/>
+    <w:p>
+      <w:r>
         <w:br/>
-        <w:t>79. Does the application handle invalid money values?</w:t>
+        <w:t>80. Is the banking logic separated from the console display logic?</w:t>
       </w:r>
     </w:p>
     <w:p>
       <w:r>
-        <w:t xml:space="preserve">Invalid money values handled </w:t>
+        <w:rPr>
+          <w:noProof/>
+        </w:rPr>
+        <w:drawing>
+          <wp:anchor distT="0" distB="0" distL="114300" distR="114300" simplePos="0" relativeHeight="251735040" behindDoc="0" locked="0" layoutInCell="1" allowOverlap="1" wp14:anchorId="3F9C4EB2" wp14:editId="65C28F80">
+            <wp:simplePos x="0" y="0"/>
+            <wp:positionH relativeFrom="margin">
+              <wp:align>left</wp:align>
+            </wp:positionH>
+            <wp:positionV relativeFrom="paragraph">
+              <wp:posOffset>227330</wp:posOffset>
+            </wp:positionV>
+            <wp:extent cx="3933825" cy="3219450"/>
+            <wp:effectExtent l="0" t="0" r="9525" b="0"/>
+            <wp:wrapTopAndBottom/>
+            <wp:docPr id="77" name="Picture 77"/>
+            <wp:cNvGraphicFramePr>
+              <a:graphicFrameLocks xmlns:a="http://schemas.openxmlformats.org/drawingml/2006/main" noChangeAspect="1"/>
+            </wp:cNvGraphicFramePr>
+            <a:graphic xmlns:a="http://schemas.openxmlformats.org/drawingml/2006/main">
+              <a:graphicData uri="http://schemas.openxmlformats.org/drawingml/2006/picture">
+                <pic:pic xmlns:pic="http://schemas.openxmlformats.org/drawingml/2006/picture">
+                  <pic:nvPicPr>
+                    <pic:cNvPr id="77" name="Screenshot 2026-05-26 130033.png"/>
+                    <pic:cNvPicPr/>
+                  </pic:nvPicPr>
+                  <pic:blipFill>
+                    <a:blip r:embed="rId77"/>
+                    <a:stretch>
+                      <a:fillRect/>
+                    </a:stretch>
+                  </pic:blipFill>
+                  <pic:spPr>
+                    <a:xfrm>
+                      <a:off x="0" y="0"/>
+                      <a:ext cx="3933825" cy="3219450"/>
+                    </a:xfrm>
+                    <a:prstGeom prst="rect">
+                      <a:avLst/>
+                    </a:prstGeom>
+                  </pic:spPr>
+                </pic:pic>
+              </a:graphicData>
+            </a:graphic>
+          </wp:anchor>
+        </w:drawing>
+      </w:r>
+      <w:r>
+        <w:t xml:space="preserve">Banking logic separated from </w:t>
       </w:r>
     </w:p>
     <w:p>
       <w:r>
         <w:br/>
-        <w:t>80. Is the banking logic separated from the console display logic?</w:t>
+      </w:r>
+      <w:r>
+        <w:br/>
       </w:r>
     </w:p>
     <w:p>
       <w:r>
-        <w:t xml:space="preserve">Banking logic separated from </w:t>
+        <w:t>Part 15 - Prepare for WPF Migration</w:t>
+      </w:r>
+      <w:bookmarkStart w:id="0" w:name="_GoBack"/>
+      <w:bookmarkEnd w:id="0"/>
+      <w:r>
+        <w:br/>
+        <w:t>81. Which parts of the app are only console UI?</w:t>
       </w:r>
     </w:p>
     <w:p>
       <w:r>
         <w:br/>
-      </w:r>
-      <w:r>
-        <w:br/>
+        <w:t>82. Which parts of the app are banking logic?</w:t>
       </w:r>
     </w:p>
     <w:p>
       <w:r>
         <w:lastRenderedPageBreak/>
-        <w:t>Part 15 - Prepare for WPF Migration</w:t>
-      </w:r>
-      <w:r>
         <w:br/>
-        <w:t>81. Which parts of the app are only console UI?</w:t>
+        <w:t>83. Which methods can be reused in WPF?</w:t>
+      </w:r>
+    </w:p>
+    <w:p/>
+    <w:p>
+      <w:r>
+        <w:br/>
+        <w:t>84. Which console inputs will become text boxes in WPF?</w:t>
       </w:r>
     </w:p>
     <w:p>
-      <w:bookmarkStart w:id="0" w:name="_GoBack"/>
-      <w:bookmarkEnd w:id="0"/>
       <w:r>
         <w:br/>
-        <w:t>82. Which parts of the app are banking logic?</w:t>
+        <w:t>85. Which console menu options will become buttons in WPF?</w:t>
       </w:r>
     </w:p>
     <w:p>
       <w:r>
         <w:br/>
-        <w:t>83. Which methods can be reused in WPF?</w:t>
-      </w:r>
-    </w:p>
-    <w:p/>
-    <w:p>
-      <w:r>
-        <w:br/>
-        <w:t>84. Which console inputs will become text boxes in WPF?</w:t>
+        <w:t>86. Which console outputs will become labels or text blocks in WPF?</w:t>
       </w:r>
     </w:p>
     <w:p>
       <w:r>
         <w:br/>
-        <w:t>85. Which console menu options will become buttons in WPF?</w:t>
-      </w:r>
-    </w:p>
-    <w:p>
-      <w:r>
-        <w:br/>
-        <w:t>86. Which console outputs will become labels or text blocks in WPF?</w:t>
-      </w:r>
-    </w:p>
-    <w:p>
-      <w:r>
-        <w:br/>
       </w:r>
       <w:r>
         <w:br/>
@@ -4481,9 +4944,6 @@
       </w:r>
       <w:r>
         <w:br/>
-      </w:r>
-      <w:r>
-        <w:lastRenderedPageBreak/>
         <w:t>Ask one question, let students answer, then code only that small part.</w:t>
       </w:r>
       <w:r>
@@ -16410,7 +16870,7 @@
 </file>
 
 <file path=customXml/itemProps1.xml><?xml version="1.0" encoding="utf-8"?>
-<ds:datastoreItem xmlns:ds="http://schemas.openxmlformats.org/officeDocument/2006/customXml" ds:itemID="{7DAAE785-581C-4063-A059-08C0EE89FF3A}">
+<ds:datastoreItem xmlns:ds="http://schemas.openxmlformats.org/officeDocument/2006/customXml" ds:itemID="{F39A38E0-F746-45A4-B379-98E3C6D42ABF}">
   <ds:schemaRefs>
     <ds:schemaRef ds:uri="http://schemas.openxmlformats.org/officeDocument/2006/bibliography"/>
   </ds:schemaRefs>

</xml_diff>